<commit_message>
Refina identidade do cartaz e destaca benefícios da Trok
</commit_message>
<xml_diff>
--- a/assets/regulamento-minuta.docx
+++ b/assets/regulamento-minuta.docx
@@ -21,7 +21,7 @@
         <w:rPr>
           <w:b w:val="0"/>
         </w:rPr>
-        <w:t>Outubro Rosa 2026 • Versão 3 • Atualização de 28 de setembro de 2026</w:t>
+        <w:t>Outubro Rosa 2026 • Versão 4 • Atualização de 29 de setembro de 2026</w:t>
       </w:r>
     </w:p>
     <w:p>
@@ -455,9 +455,7 @@
       </w:r>
     </w:p>
     <w:p>
-      <w:r>
-        <w:br w:type="page"/>
-      </w:r>
+      <w:r/>
     </w:p>
     <w:p>
       <w:pPr>
@@ -548,7 +546,7 @@
         <w:spacing w:before="200" w:after="120"/>
       </w:pPr>
       <w:r>
-        <w:t>5 Desconto e contribuição da Trok</w:t>
+        <w:t>5 Benefícios e contribuição da Trok</w:t>
       </w:r>
     </w:p>
     <w:p>
@@ -601,6 +599,16 @@
     </w:p>
     <w:p>
       <w:pPr>
+        <w:widowControl/>
+        <w:spacing w:after="120" w:line="259" w:lineRule="auto"/>
+      </w:pPr>
+      <w:pPr/>
+      <w:r>
+        <w:t>5.5 Além do desconto, a Trok oferecerá oxi-sanitização grátis exclusivamente para mulheres. O benefício é próprio da Trok e não se estende automaticamente às empresas parceiras. Condições operacionais de atendimento, período e eventual necessidade de agendamento: [DEFINIR ANTES DA VERSÃO DEFINITIVA].</w:t>
+      </w:r>
+    </w:p>
+    <w:p>
+      <w:pPr>
         <w:pStyle w:val="Heading1"/>
         <w:keepNext/>
         <w:spacing w:before="200" w:after="120"/>
@@ -634,9 +642,7 @@
       </w:r>
     </w:p>
     <w:p>
-      <w:r>
-        <w:br w:type="page"/>
-      </w:r>
+      <w:r/>
     </w:p>
     <w:p>
       <w:pPr>
@@ -813,9 +819,7 @@
       </w:r>
     </w:p>
     <w:p>
-      <w:r>
-        <w:br w:type="page"/>
-      </w:r>
+      <w:r/>
     </w:p>
     <w:p>
       <w:pPr>
@@ -992,14 +996,13 @@
       </w:r>
     </w:p>
     <w:p>
-      <w:r>
-        <w:br w:type="page"/>
-      </w:r>
+      <w:r/>
     </w:p>
     <w:p>
       <w:pPr>
         <w:pStyle w:val="Heading1"/>
         <w:keepNext/>
+        <w:pageBreakBefore/>
         <w:spacing w:before="200" w:after="120"/>
       </w:pPr>
       <w:r>
@@ -1173,7 +1176,7 @@
                 <w:color w:val="000000"/>
                 <w:sz w:val="18"/>
               </w:rPr>
-              <w:t>10% de desconto em todos os serviços e destinação de 10% do valor efetivamente pago, após o desconto.</w:t>
+              <w:t>10% de desconto em todos os serviços; oxi-sanitização grátis exclusivamente para mulheres; e destinação de 10% do valor efetivamente pago, após o desconto.</w:t>
             </w:r>
           </w:p>
         </w:tc>
@@ -1704,7 +1707,7 @@
         <w:rPr>
           <w:b w:val="0"/>
         </w:rPr>
-        <w:t>Confirmar antes da versão definitiva: razão social e CNPJ da realizadora e da Rede; anuência da instituição; lista das 14 parceiras; endereço do evento; URL do cadastro e contatos; prazos de compras, cadastro e validação; geração e limite de chances; impedimentos; método e horário da apuração; acumulação de colocações; presença no evento; suplentes; prêmios e condições; prazo de resposta e entrega; repasses e retenção de dados.</w:t>
+        <w:t>Confirmar antes da versão definitiva: razão social e CNPJ da realizadora e da Rede; anuência da instituição; lista das 14 parceiras; endereço do evento; URL do cadastro e contatos; prazos de compras, cadastro e validação; geração e limite de chances; impedimentos; método e horário da apuração; acumulação de colocações; presença no evento; suplentes; prêmios e condições; prazo de resposta e entrega; repasses, condições operacionais da oxi-sanitização e retenção de dados.</w:t>
       </w:r>
     </w:p>
     <w:p>
@@ -1767,7 +1770,7 @@
         <w:color w:val="646464"/>
         <w:sz w:val="16"/>
       </w:rPr>
-      <w:t xml:space="preserve">Cuidar Move a Gente • Minuta V3 • 28/09/2026 • </w:t>
+      <w:t xml:space="preserve">Cuidar Move a Gente • Minuta V4 • 29/09/2026 • </w:t>
     </w:r>
     <w:fldSimple w:instr="PAGE"/>
   </w:p>

</xml_diff>